<commit_message>
docs(kt06): complete mobile testing strategy and analysis
Co-authored-by: Cursor <cursoragent@cursor.com>
</commit_message>
<xml_diff>
--- a/reports/KT06.docx
+++ b/reports/KT06.docx
@@ -136,7 +136,7 @@
           <w:b/>
           <w:sz w:val="28"/>
         </w:rPr>
-        <w:t>1. Цель и объект тестирования</w:t>
+        <w:t>1. Цель и выбор приложения</w:t>
       </w:r>
     </w:p>
     <w:p>
@@ -149,7 +149,20 @@
           <w:b w:val="0"/>
           <w:sz w:val="24"/>
         </w:rPr>
-        <w:t>Выполнить UI-автотесты официального приложения ApiDemos (Appium sample) через Appium 3 + UiAutomator2 на Android-эмуляторе. Объект: package io.appium.android.apis, APK v6.0.18.</w:t>
+        <w:t>Выполнить UI-автотесты официального sample ApiDemos через Appium 3 + UiAutomator2. Package io.appium.android.apis, APK v6.0.18.</w:t>
+      </w:r>
+    </w:p>
+    <w:p>
+      <w:pPr>
+        <w:spacing w:after="120" w:line="276" w:lineRule="auto"/>
+      </w:pPr>
+      <w:r>
+        <w:rPr>
+          <w:rFonts w:ascii="Times New Roman" w:hAnsi="Times New Roman" w:eastAsia="Times New Roman"/>
+          <w:b w:val="0"/>
+          <w:sz w:val="24"/>
+        </w:rPr>
+        <w:t>Почему ApiDemos: публичный sample, воспроизводимость, стабильные accessibility id, детерминированные экраны. Ограничения: не production — платежи/бизнес-auth NOT APPLICABLE. Подробнее: mobile/docs/kt06-test-plan.md.</w:t>
       </w:r>
     </w:p>
     <w:p>
@@ -728,7 +741,7 @@
           <w:b/>
           <w:sz w:val="28"/>
         </w:rPr>
-        <w:t>6. Архитектура</w:t>
+        <w:t>6. Типы тестирования и платформа</w:t>
       </w:r>
     </w:p>
     <w:p>
@@ -741,7 +754,7 @@
           <w:b w:val="0"/>
           <w:sz w:val="24"/>
         </w:rPr>
-        <w:t>Page Object: mobile/pages/ (ApiDemosHomePage, AlertDialogsPage, ViewsTextFieldsPage).</w:t>
+        <w:t>Functional: launch, меню, диалоги, ввод, Back, TextFields — исполнены.</w:t>
       </w:r>
     </w:p>
     <w:p>
@@ -754,7 +767,7 @@
           <w:b w:val="0"/>
           <w:sz w:val="24"/>
         </w:rPr>
-        <w:t>Тесты: mobile/tests/test_kt06_appium.py (7 кейсов, session-scoped driver).</w:t>
+        <w:t>Usability: наблюдения по скриншотам/навигации (не отдельная UX-сессия).</w:t>
       </w:r>
     </w:p>
     <w:p>
@@ -767,7 +780,33 @@
           <w:b w:val="0"/>
           <w:sz w:val="24"/>
         </w:rPr>
-        <w:t>Между тестами: mobile: startActivity на io.appium.android.apis/.ApiDemos.</w:t>
+        <w:t>Performance: длительность suite 44.63 с как ориентир среды (не SLA продукта).</w:t>
+      </w:r>
+    </w:p>
+    <w:p>
+      <w:pPr>
+        <w:spacing w:after="120" w:line="276" w:lineRule="auto"/>
+      </w:pPr>
+      <w:r>
+        <w:rPr>
+          <w:rFonts w:ascii="Times New Roman" w:hAnsi="Times New Roman" w:eastAsia="Times New Roman"/>
+          <w:b w:val="0"/>
+          <w:sz w:val="24"/>
+        </w:rPr>
+        <w:t>Compatibility: Android API 36 emulator only; real device / другие API — NOT RUN.</w:t>
+      </w:r>
+    </w:p>
+    <w:p>
+      <w:pPr>
+        <w:spacing w:after="120" w:line="276" w:lineRule="auto"/>
+      </w:pPr>
+      <w:r>
+        <w:rPr>
+          <w:rFonts w:ascii="Times New Roman" w:hAnsi="Times New Roman" w:eastAsia="Times New Roman"/>
+          <w:b w:val="0"/>
+          <w:sz w:val="24"/>
+        </w:rPr>
+        <w:t>Эмулятор vs устройство: DPI/тайминги могут отличаться.</w:t>
       </w:r>
     </w:p>
     <w:p>
@@ -780,7 +819,72 @@
           <w:b/>
           <w:sz w:val="28"/>
         </w:rPr>
-        <w:t>7. Скриншоты</w:t>
+        <w:t>7. Дефекты и рекомендации</w:t>
+      </w:r>
+    </w:p>
+    <w:p>
+      <w:pPr>
+        <w:spacing w:after="120" w:line="276" w:lineRule="auto"/>
+      </w:pPr>
+      <w:r>
+        <w:rPr>
+          <w:rFonts w:ascii="Times New Roman" w:hAnsi="Times New Roman" w:eastAsia="Times New Roman"/>
+          <w:b w:val="0"/>
+          <w:sz w:val="24"/>
+        </w:rPr>
+        <w:t>Подтверждённых дефектов ApiDemos нет. INC-06-01: FAIL TextFields из-за отсутствия scroll в тесте — исправлено в Page Object. Рекомендации: real device, доп. API, не заявлять payment/auth для demo. См. kt06-defect-analysis.md / kt06-recommendations.md.</w:t>
+      </w:r>
+    </w:p>
+    <w:p>
+      <w:pPr>
+        <w:pStyle w:val="Heading1"/>
+      </w:pPr>
+      <w:r>
+        <w:rPr>
+          <w:rFonts w:ascii="Times New Roman" w:hAnsi="Times New Roman" w:eastAsia="Times New Roman"/>
+          <w:b/>
+          <w:sz w:val="28"/>
+        </w:rPr>
+        <w:t>8. Архитектура</w:t>
+      </w:r>
+    </w:p>
+    <w:p>
+      <w:pPr>
+        <w:spacing w:after="120" w:line="276" w:lineRule="auto"/>
+      </w:pPr>
+      <w:r>
+        <w:rPr>
+          <w:rFonts w:ascii="Times New Roman" w:hAnsi="Times New Roman" w:eastAsia="Times New Roman"/>
+          <w:b w:val="0"/>
+          <w:sz w:val="24"/>
+        </w:rPr>
+        <w:t>Page Object: mobile/pages/; тесты: mobile/tests/test_kt06_appium.py.</w:t>
+      </w:r>
+    </w:p>
+    <w:p>
+      <w:pPr>
+        <w:spacing w:after="120" w:line="276" w:lineRule="auto"/>
+      </w:pPr>
+      <w:r>
+        <w:rPr>
+          <w:rFonts w:ascii="Times New Roman" w:hAnsi="Times New Roman" w:eastAsia="Times New Roman"/>
+          <w:b w:val="0"/>
+          <w:sz w:val="24"/>
+        </w:rPr>
+        <w:t>Между тестами: mobile: startActivity → .ApiDemos.</w:t>
+      </w:r>
+    </w:p>
+    <w:p>
+      <w:pPr>
+        <w:pStyle w:val="Heading1"/>
+      </w:pPr>
+      <w:r>
+        <w:rPr>
+          <w:rFonts w:ascii="Times New Roman" w:hAnsi="Times New Roman" w:eastAsia="Times New Roman"/>
+          <w:b/>
+          <w:sz w:val="28"/>
+        </w:rPr>
+        <w:t>9. Скриншоты</w:t>
       </w:r>
     </w:p>
     <w:p>
@@ -1185,7 +1289,7 @@
           <w:b/>
           <w:sz w:val="28"/>
         </w:rPr>
-        <w:t>8. Заключение</w:t>
+        <w:t>10. Заключение</w:t>
       </w:r>
     </w:p>
     <w:p>
@@ -1198,7 +1302,7 @@
           <w:b w:val="0"/>
           <w:sz w:val="24"/>
         </w:rPr>
-        <w:t>КТ 06 выполнена на новом ПК с существующим эмулятором Medium_Phone_API_36.1. Диагностический тест и финальный suite (7/7 PASS) подтверждены реальными артефактами и скриншотами. Первый полный прогон зафиксировал 1 FAIL из-за необходимости прокрутки списка Views; после исправления Page Object сценарий TextFields проходит. KT07/KT09 не начинались. Push в GitHub не выполнялся.</w:t>
+        <w:t>КТ 06: стратегия, типы тестирования, кейсы с actual results, анализ дефектов и рекомендации документированы. Финальный suite 7/7 PASS (44.63 с) на AVD API 36. История suite №1 (6/1) сохранена. Push не выполнялся.</w:t>
       </w:r>
     </w:p>
     <w:sectPr>

</xml_diff>

<commit_message>
docs(kt06): complete mobile testing strategy and reporting
Expand ApiDemos suite to 10 PASS (Cancel, clear/hint, a11y) and refresh DOCX evidence.

Co-authored-by: Cursor <cursoragent@cursor.com>
</commit_message>
<xml_diff>
--- a/reports/KT06.docx
+++ b/reports/KT06.docx
@@ -123,7 +123,7 @@
           <w:b w:val="0"/>
           <w:sz w:val="24"/>
         </w:rPr>
-        <w:t>Дата: 2026-10-09</w:t>
+        <w:t>Дата обновления: 2026-10-11</w:t>
       </w:r>
     </w:p>
     <w:p>
@@ -435,7 +435,33 @@
           <w:b/>
           <w:sz w:val="28"/>
         </w:rPr>
-        <w:t>5. Результаты финального прогона (7/7)</w:t>
+        <w:t>5. Результаты прогонов</w:t>
+      </w:r>
+    </w:p>
+    <w:p>
+      <w:pPr>
+        <w:spacing w:after="120" w:line="276" w:lineRule="auto"/>
+      </w:pPr>
+      <w:r>
+        <w:rPr>
+          <w:rFonts w:ascii="Times New Roman" w:hAnsi="Times New Roman" w:eastAsia="Times New Roman"/>
+          <w:b w:val="0"/>
+          <w:sz w:val="24"/>
+        </w:rPr>
+        <w:t>Исторический финал (2026-10-09): 7 PASS / 44.63 с — сохранён.</w:t>
+      </w:r>
+    </w:p>
+    <w:p>
+      <w:pPr>
+        <w:spacing w:after="120" w:line="276" w:lineRule="auto"/>
+      </w:pPr>
+      <w:r>
+        <w:rPr>
+          <w:rFonts w:ascii="Times New Roman" w:hAnsi="Times New Roman" w:eastAsia="Times New Roman"/>
+          <w:b w:val="0"/>
+          <w:sz w:val="24"/>
+        </w:rPr>
+        <w:t>Remediation (2026-10-11): 10 PASS / 67.70 с — + Cancel, clear/hint, a11y.</w:t>
       </w:r>
     </w:p>
     <w:tbl>
@@ -705,6 +731,102 @@
           </w:p>
         </w:tc>
       </w:tr>
+      <w:tr>
+        <w:tc>
+          <w:tcPr>
+            <w:tcW w:type="dxa" w:w="3324"/>
+          </w:tcPr>
+          <w:p>
+            <w:r>
+              <w:t>TC-06-08</w:t>
+            </w:r>
+          </w:p>
+        </w:tc>
+        <w:tc>
+          <w:tcPr>
+            <w:tcW w:type="dxa" w:w="3324"/>
+          </w:tcPr>
+          <w:p>
+            <w:r>
+              <w:t>test_text_entry_dialog_cancel</w:t>
+            </w:r>
+          </w:p>
+        </w:tc>
+        <w:tc>
+          <w:tcPr>
+            <w:tcW w:type="dxa" w:w="3324"/>
+          </w:tcPr>
+          <w:p>
+            <w:r>
+              <w:t>PASS</w:t>
+            </w:r>
+          </w:p>
+        </w:tc>
+      </w:tr>
+      <w:tr>
+        <w:tc>
+          <w:tcPr>
+            <w:tcW w:type="dxa" w:w="3324"/>
+          </w:tcPr>
+          <w:p>
+            <w:r>
+              <w:t>TC-06-09</w:t>
+            </w:r>
+          </w:p>
+        </w:tc>
+        <w:tc>
+          <w:tcPr>
+            <w:tcW w:type="dxa" w:w="3324"/>
+          </w:tcPr>
+          <w:p>
+            <w:r>
+              <w:t>test_textfields_empty_after_clear</w:t>
+            </w:r>
+          </w:p>
+        </w:tc>
+        <w:tc>
+          <w:tcPr>
+            <w:tcW w:type="dxa" w:w="3324"/>
+          </w:tcPr>
+          <w:p>
+            <w:r>
+              <w:t>PASS</w:t>
+            </w:r>
+          </w:p>
+        </w:tc>
+      </w:tr>
+      <w:tr>
+        <w:tc>
+          <w:tcPr>
+            <w:tcW w:type="dxa" w:w="3324"/>
+          </w:tcPr>
+          <w:p>
+            <w:r>
+              <w:t>TC-06-10</w:t>
+            </w:r>
+          </w:p>
+        </w:tc>
+        <w:tc>
+          <w:tcPr>
+            <w:tcW w:type="dxa" w:w="3324"/>
+          </w:tcPr>
+          <w:p>
+            <w:r>
+              <w:t>test_home_menu_accessibility_labels</w:t>
+            </w:r>
+          </w:p>
+        </w:tc>
+        <w:tc>
+          <w:tcPr>
+            <w:tcW w:type="dxa" w:w="3324"/>
+          </w:tcPr>
+          <w:p>
+            <w:r>
+              <w:t>PASS</w:t>
+            </w:r>
+          </w:p>
+        </w:tc>
+      </w:tr>
     </w:tbl>
     <w:p>
       <w:pPr>
@@ -729,6 +851,19 @@
           <w:sz w:val="18"/>
         </w:rPr>
         <w:t>============================= 7 passed in 44.63s =============================</w:t>
+      </w:r>
+    </w:p>
+    <w:p>
+      <w:pPr>
+        <w:spacing w:after="0" w:before="0"/>
+      </w:pPr>
+      <w:r>
+        <w:rPr>
+          <w:rFonts w:ascii="Consolas" w:hAnsi="Consolas" w:eastAsia="Consolas"/>
+          <w:b w:val="0"/>
+          <w:sz w:val="18"/>
+        </w:rPr>
+        <w:t>======================== 10 passed in 67.70s (0:01:07) ========================</w:t>
       </w:r>
     </w:p>
     <w:p>
@@ -767,6 +902,32 @@
           <w:b w:val="0"/>
           <w:sz w:val="24"/>
         </w:rPr>
+        <w:t>Negative/dismiss: Cancel Text Entry; clear TextFields (hint остаётся).</w:t>
+      </w:r>
+    </w:p>
+    <w:p>
+      <w:pPr>
+        <w:spacing w:after="120" w:line="276" w:lineRule="auto"/>
+      </w:pPr>
+      <w:r>
+        <w:rPr>
+          <w:rFonts w:ascii="Times New Roman" w:hAnsi="Times New Roman" w:eastAsia="Times New Roman"/>
+          <w:b w:val="0"/>
+          <w:sz w:val="24"/>
+        </w:rPr>
+        <w:t>Accessibility: content-desc App/Views на Home.</w:t>
+      </w:r>
+    </w:p>
+    <w:p>
+      <w:pPr>
+        <w:spacing w:after="120" w:line="276" w:lineRule="auto"/>
+      </w:pPr>
+      <w:r>
+        <w:rPr>
+          <w:rFonts w:ascii="Times New Roman" w:hAnsi="Times New Roman" w:eastAsia="Times New Roman"/>
+          <w:b w:val="0"/>
+          <w:sz w:val="24"/>
+        </w:rPr>
         <w:t>Usability: наблюдения по скриншотам/навигации (не отдельная UX-сессия).</w:t>
       </w:r>
     </w:p>
@@ -780,7 +941,7 @@
           <w:b w:val="0"/>
           <w:sz w:val="24"/>
         </w:rPr>
-        <w:t>Performance: длительность suite 44.63 с как ориентир среды (не SLA продукта).</w:t>
+        <w:t>Performance: 67.70 с / 10 TC как ориентир среды (не SLA продукта).</w:t>
       </w:r>
     </w:p>
     <w:p>
@@ -832,7 +993,7 @@
           <w:b w:val="0"/>
           <w:sz w:val="24"/>
         </w:rPr>
-        <w:t>Подтверждённых дефектов ApiDemos нет. INC-06-01: FAIL TextFields из-за отсутствия scroll в тесте — исправлено в Page Object. Рекомендации: real device, доп. API, не заявлять payment/auth для demo. См. kt06-defect-analysis.md / kt06-recommendations.md.</w:t>
+        <w:t>Подтверждённых дефектов ApiDemos нет. INC-06-01: FAIL TextFields из-за отсутствия scroll в тесте — исправлено в Page Object. После clear EditText показывает hint («hint text») — ожидаемое поведение Android, не баг приложения. Рекомендации: real device, доп. API, не заявлять payment/auth для demo.</w:t>
       </w:r>
     </w:p>
     <w:p>
@@ -1145,11 +1306,11 @@
               <a:graphicData uri="http://schemas.openxmlformats.org/drawingml/2006/picture">
                 <pic:pic>
                   <pic:nvPicPr>
-                    <pic:cNvPr id="0" name="06_back_to_app_menu.png"/>
+                    <pic:cNvPr id="0" name="02_app_menu.png"/>
                     <pic:cNvPicPr/>
                   </pic:nvPicPr>
                   <pic:blipFill>
-                    <a:blip r:embed="rId14"/>
+                    <a:blip r:embed="rId10"/>
                     <a:stretch>
                       <a:fillRect/>
                     </a:stretch>
@@ -1194,11 +1355,11 @@
               <a:graphicData uri="http://schemas.openxmlformats.org/drawingml/2006/picture">
                 <pic:pic>
                   <pic:nvPicPr>
-                    <pic:cNvPr id="0" name="07_back_to_home.png"/>
+                    <pic:cNvPr id="0" name="01_app_home.png"/>
                     <pic:cNvPicPr/>
                   </pic:nvPicPr>
                   <pic:blipFill>
-                    <a:blip r:embed="rId15"/>
+                    <a:blip r:embed="rId9"/>
                     <a:stretch>
                       <a:fillRect/>
                     </a:stretch>
@@ -1247,7 +1408,7 @@
                     <pic:cNvPicPr/>
                   </pic:nvPicPr>
                   <pic:blipFill>
-                    <a:blip r:embed="rId16"/>
+                    <a:blip r:embed="rId14"/>
                     <a:stretch>
                       <a:fillRect/>
                     </a:stretch>
@@ -1280,6 +1441,202 @@
       </w:r>
     </w:p>
     <w:p>
+      <w:r>
+        <w:drawing>
+          <wp:inline xmlns:a="http://schemas.openxmlformats.org/drawingml/2006/main" xmlns:pic="http://schemas.openxmlformats.org/drawingml/2006/picture">
+            <wp:extent cx="3240000" cy="7200000"/>
+            <wp:docPr id="9" name="Picture 9"/>
+            <wp:cNvGraphicFramePr>
+              <a:graphicFrameLocks noChangeAspect="1"/>
+            </wp:cNvGraphicFramePr>
+            <a:graphic>
+              <a:graphicData uri="http://schemas.openxmlformats.org/drawingml/2006/picture">
+                <pic:pic>
+                  <pic:nvPicPr>
+                    <pic:cNvPr id="0" name="09_dialog_before_cancel.png"/>
+                    <pic:cNvPicPr/>
+                  </pic:nvPicPr>
+                  <pic:blipFill>
+                    <a:blip r:embed="rId15"/>
+                    <a:stretch>
+                      <a:fillRect/>
+                    </a:stretch>
+                  </pic:blipFill>
+                  <pic:spPr>
+                    <a:xfrm>
+                      <a:off x="0" y="0"/>
+                      <a:ext cx="3240000" cy="7200000"/>
+                    </a:xfrm>
+                    <a:prstGeom prst="rect"/>
+                  </pic:spPr>
+                </pic:pic>
+              </a:graphicData>
+            </a:graphic>
+          </wp:inline>
+        </w:drawing>
+      </w:r>
+    </w:p>
+    <w:p>
+      <w:pPr>
+        <w:jc w:val="center"/>
+      </w:pPr>
+      <w:r>
+        <w:rPr>
+          <w:rFonts w:ascii="Times New Roman" w:hAnsi="Times New Roman" w:eastAsia="Times New Roman"/>
+          <w:b w:val="0"/>
+          <w:sz w:val="22"/>
+        </w:rPr>
+        <w:t>Рисунок 9 — Text Entry до Cancel</w:t>
+      </w:r>
+    </w:p>
+    <w:p>
+      <w:r>
+        <w:drawing>
+          <wp:inline xmlns:a="http://schemas.openxmlformats.org/drawingml/2006/main" xmlns:pic="http://schemas.openxmlformats.org/drawingml/2006/picture">
+            <wp:extent cx="3240000" cy="7200000"/>
+            <wp:docPr id="10" name="Picture 10"/>
+            <wp:cNvGraphicFramePr>
+              <a:graphicFrameLocks noChangeAspect="1"/>
+            </wp:cNvGraphicFramePr>
+            <a:graphic>
+              <a:graphicData uri="http://schemas.openxmlformats.org/drawingml/2006/picture">
+                <pic:pic>
+                  <pic:nvPicPr>
+                    <pic:cNvPr id="0" name="10_dialog_after_cancel.png"/>
+                    <pic:cNvPicPr/>
+                  </pic:nvPicPr>
+                  <pic:blipFill>
+                    <a:blip r:embed="rId16"/>
+                    <a:stretch>
+                      <a:fillRect/>
+                    </a:stretch>
+                  </pic:blipFill>
+                  <pic:spPr>
+                    <a:xfrm>
+                      <a:off x="0" y="0"/>
+                      <a:ext cx="3240000" cy="7200000"/>
+                    </a:xfrm>
+                    <a:prstGeom prst="rect"/>
+                  </pic:spPr>
+                </pic:pic>
+              </a:graphicData>
+            </a:graphic>
+          </wp:inline>
+        </w:drawing>
+      </w:r>
+    </w:p>
+    <w:p>
+      <w:pPr>
+        <w:jc w:val="center"/>
+      </w:pPr>
+      <w:r>
+        <w:rPr>
+          <w:rFonts w:ascii="Times New Roman" w:hAnsi="Times New Roman" w:eastAsia="Times New Roman"/>
+          <w:b w:val="0"/>
+          <w:sz w:val="22"/>
+        </w:rPr>
+        <w:t>Рисунок 10 — Text Entry после Cancel</w:t>
+      </w:r>
+    </w:p>
+    <w:p>
+      <w:r>
+        <w:drawing>
+          <wp:inline xmlns:a="http://schemas.openxmlformats.org/drawingml/2006/main" xmlns:pic="http://schemas.openxmlformats.org/drawingml/2006/picture">
+            <wp:extent cx="3240000" cy="7200000"/>
+            <wp:docPr id="11" name="Picture 11"/>
+            <wp:cNvGraphicFramePr>
+              <a:graphicFrameLocks noChangeAspect="1"/>
+            </wp:cNvGraphicFramePr>
+            <a:graphic>
+              <a:graphicData uri="http://schemas.openxmlformats.org/drawingml/2006/picture">
+                <pic:pic>
+                  <pic:nvPicPr>
+                    <pic:cNvPr id="0" name="11_textfields_cleared.png"/>
+                    <pic:cNvPicPr/>
+                  </pic:nvPicPr>
+                  <pic:blipFill>
+                    <a:blip r:embed="rId17"/>
+                    <a:stretch>
+                      <a:fillRect/>
+                    </a:stretch>
+                  </pic:blipFill>
+                  <pic:spPr>
+                    <a:xfrm>
+                      <a:off x="0" y="0"/>
+                      <a:ext cx="3240000" cy="7200000"/>
+                    </a:xfrm>
+                    <a:prstGeom prst="rect"/>
+                  </pic:spPr>
+                </pic:pic>
+              </a:graphicData>
+            </a:graphic>
+          </wp:inline>
+        </w:drawing>
+      </w:r>
+    </w:p>
+    <w:p>
+      <w:pPr>
+        <w:jc w:val="center"/>
+      </w:pPr>
+      <w:r>
+        <w:rPr>
+          <w:rFonts w:ascii="Times New Roman" w:hAnsi="Times New Roman" w:eastAsia="Times New Roman"/>
+          <w:b w:val="0"/>
+          <w:sz w:val="22"/>
+        </w:rPr>
+        <w:t>Рисунок 11 — TextFields после clear</w:t>
+      </w:r>
+    </w:p>
+    <w:p>
+      <w:r>
+        <w:drawing>
+          <wp:inline xmlns:a="http://schemas.openxmlformats.org/drawingml/2006/main" xmlns:pic="http://schemas.openxmlformats.org/drawingml/2006/picture">
+            <wp:extent cx="3240000" cy="7200000"/>
+            <wp:docPr id="12" name="Picture 12"/>
+            <wp:cNvGraphicFramePr>
+              <a:graphicFrameLocks noChangeAspect="1"/>
+            </wp:cNvGraphicFramePr>
+            <a:graphic>
+              <a:graphicData uri="http://schemas.openxmlformats.org/drawingml/2006/picture">
+                <pic:pic>
+                  <pic:nvPicPr>
+                    <pic:cNvPr id="0" name="12_home_a11y.png"/>
+                    <pic:cNvPicPr/>
+                  </pic:nvPicPr>
+                  <pic:blipFill>
+                    <a:blip r:embed="rId18"/>
+                    <a:stretch>
+                      <a:fillRect/>
+                    </a:stretch>
+                  </pic:blipFill>
+                  <pic:spPr>
+                    <a:xfrm>
+                      <a:off x="0" y="0"/>
+                      <a:ext cx="3240000" cy="7200000"/>
+                    </a:xfrm>
+                    <a:prstGeom prst="rect"/>
+                  </pic:spPr>
+                </pic:pic>
+              </a:graphicData>
+            </a:graphic>
+          </wp:inline>
+        </w:drawing>
+      </w:r>
+    </w:p>
+    <w:p>
+      <w:pPr>
+        <w:jc w:val="center"/>
+      </w:pPr>
+      <w:r>
+        <w:rPr>
+          <w:rFonts w:ascii="Times New Roman" w:hAnsi="Times New Roman" w:eastAsia="Times New Roman"/>
+          <w:b w:val="0"/>
+          <w:sz w:val="22"/>
+        </w:rPr>
+        <w:t>Рисунок 12 — Home accessibility labels</w:t>
+      </w:r>
+    </w:p>
+    <w:p>
       <w:pPr>
         <w:pStyle w:val="Heading1"/>
       </w:pPr>
@@ -1302,7 +1659,7 @@
           <w:b w:val="0"/>
           <w:sz w:val="24"/>
         </w:rPr>
-        <w:t>КТ 06: стратегия, типы тестирования, кейсы с actual results, анализ дефектов и рекомендации документированы. Финальный suite 7/7 PASS (44.63 с) на AVD API 36. История suite №1 (6/1) сохранена. Push не выполнялся.</w:t>
+        <w:t>КТ 06: стратегия, типы тестирования, кейсы с actual results, анализ дефектов и рекомендации документированы. Исторический suite 7/7 PASS (44.63 с); remediation 10/10 PASS (67.70 с) на AVD API 36. Push не выполнялся.</w:t>
       </w:r>
     </w:p>
     <w:sectPr>

</xml_diff>